<commit_message>
edit the technical assignment.docx
</commit_message>
<xml_diff>
--- a/Տեխնիկական Առաջադրանք.docx
+++ b/Տեխնիկական Առաջադրանք.docx
@@ -6921,7 +6921,7 @@
           <w:sz w:val="48"/>
           <w:szCs w:val="48"/>
         </w:rPr>
-        <w:t>11</w:t>
+        <w:t>1</w:t>
       </w:r>
       <w:r>
         <w:rPr>
@@ -6932,200 +6932,9 @@
           <w:sz w:val="48"/>
           <w:szCs w:val="48"/>
         </w:rPr>
-        <w:t>. Հետագա զարգացման հնարավորություններ</w:t>
-      </w:r>
-    </w:p>
-    <w:p>
-      <w:pPr>
-        <w:spacing w:before="100" w:beforeAutospacing="1" w:after="100" w:afterAutospacing="1" w:line="240" w:lineRule="auto"/>
-        <w:rPr>
-          <w:rFonts w:ascii="Times New Roman" w:eastAsia="Times New Roman" w:hAnsi="Times New Roman" w:cs="Times New Roman"/>
-          <w:sz w:val="24"/>
-          <w:szCs w:val="24"/>
-        </w:rPr>
-      </w:pPr>
-      <w:r>
-        <w:rPr>
-          <w:rFonts w:ascii="Times New Roman" w:eastAsia="Times New Roman" w:hAnsi="Times New Roman" w:cs="Times New Roman"/>
-          <w:sz w:val="24"/>
-          <w:szCs w:val="24"/>
-        </w:rPr>
-        <w:t>Ապագայում հնարավոր է ավելացնել՝</w:t>
-      </w:r>
-    </w:p>
-    <w:p>
-      <w:pPr>
-        <w:numPr>
-          <w:ilvl w:val="0"/>
-          <w:numId w:val="29"/>
-        </w:numPr>
-        <w:spacing w:before="100" w:beforeAutospacing="1" w:after="100" w:afterAutospacing="1" w:line="240" w:lineRule="auto"/>
-        <w:rPr>
-          <w:rFonts w:ascii="Times New Roman" w:eastAsia="Times New Roman" w:hAnsi="Times New Roman" w:cs="Times New Roman"/>
-          <w:sz w:val="24"/>
-          <w:szCs w:val="24"/>
-        </w:rPr>
-      </w:pPr>
-      <w:r>
-        <w:rPr>
-          <w:rFonts w:ascii="Times New Roman" w:eastAsia="Times New Roman" w:hAnsi="Times New Roman" w:cs="Times New Roman"/>
-          <w:sz w:val="24"/>
-          <w:szCs w:val="24"/>
-        </w:rPr>
-        <w:t>խմբային չատեր,</w:t>
-      </w:r>
-    </w:p>
-    <w:p>
-      <w:pPr>
-        <w:numPr>
-          <w:ilvl w:val="0"/>
-          <w:numId w:val="29"/>
-        </w:numPr>
-        <w:spacing w:before="100" w:beforeAutospacing="1" w:after="100" w:afterAutospacing="1" w:line="240" w:lineRule="auto"/>
-        <w:rPr>
-          <w:rFonts w:ascii="Times New Roman" w:eastAsia="Times New Roman" w:hAnsi="Times New Roman" w:cs="Times New Roman"/>
-          <w:sz w:val="24"/>
-          <w:szCs w:val="24"/>
-        </w:rPr>
-      </w:pPr>
-      <w:r>
-        <w:rPr>
-          <w:rFonts w:ascii="Times New Roman" w:eastAsia="Times New Roman" w:hAnsi="Times New Roman" w:cs="Times New Roman"/>
-          <w:sz w:val="24"/>
-          <w:szCs w:val="24"/>
-        </w:rPr>
-        <w:t>WebSocket</w:t>
-      </w:r>
-      <w:r>
-        <w:rPr>
-          <w:rFonts w:ascii="Times New Roman" w:eastAsia="Times New Roman" w:hAnsi="Times New Roman" w:cs="Times New Roman"/>
-          <w:sz w:val="24"/>
-          <w:szCs w:val="24"/>
-          <w:lang w:val="hy-AM"/>
-        </w:rPr>
-        <w:t>,</w:t>
-      </w:r>
-      <w:r>
-        <w:rPr>
-          <w:rFonts w:ascii="Times New Roman" w:eastAsia="Times New Roman" w:hAnsi="Times New Roman" w:cs="Times New Roman"/>
-          <w:sz w:val="24"/>
-          <w:szCs w:val="24"/>
-        </w:rPr>
-        <w:t xml:space="preserve"> AJAX polling-ի փոխարեն,</w:t>
-      </w:r>
-    </w:p>
-    <w:p>
-      <w:pPr>
-        <w:numPr>
-          <w:ilvl w:val="0"/>
-          <w:numId w:val="29"/>
-        </w:numPr>
-        <w:spacing w:before="100" w:beforeAutospacing="1" w:after="100" w:afterAutospacing="1" w:line="240" w:lineRule="auto"/>
-        <w:rPr>
-          <w:rFonts w:ascii="Times New Roman" w:eastAsia="Times New Roman" w:hAnsi="Times New Roman" w:cs="Times New Roman"/>
-          <w:sz w:val="24"/>
-          <w:szCs w:val="24"/>
-        </w:rPr>
-      </w:pPr>
-      <w:r>
-        <w:rPr>
-          <w:rFonts w:ascii="Times New Roman" w:eastAsia="Times New Roman" w:hAnsi="Times New Roman" w:cs="Times New Roman"/>
-          <w:sz w:val="24"/>
-          <w:szCs w:val="24"/>
-        </w:rPr>
-        <w:t>ծանուցումներ,</w:t>
-      </w:r>
-    </w:p>
-    <w:p>
-      <w:pPr>
-        <w:numPr>
-          <w:ilvl w:val="0"/>
-          <w:numId w:val="29"/>
-        </w:numPr>
-        <w:spacing w:before="100" w:beforeAutospacing="1" w:after="100" w:afterAutospacing="1" w:line="240" w:lineRule="auto"/>
-        <w:rPr>
-          <w:rFonts w:ascii="Times New Roman" w:eastAsia="Times New Roman" w:hAnsi="Times New Roman" w:cs="Times New Roman"/>
-          <w:sz w:val="24"/>
-          <w:szCs w:val="24"/>
-        </w:rPr>
-      </w:pPr>
-      <w:r>
-        <w:rPr>
-          <w:rFonts w:ascii="Times New Roman" w:eastAsia="Times New Roman" w:hAnsi="Times New Roman" w:cs="Times New Roman"/>
-          <w:sz w:val="24"/>
-          <w:szCs w:val="24"/>
-        </w:rPr>
-        <w:t>հաղորդագրությունների կոդավորում,</w:t>
-      </w:r>
-    </w:p>
-    <w:p>
-      <w:pPr>
-        <w:numPr>
-          <w:ilvl w:val="0"/>
-          <w:numId w:val="29"/>
-        </w:numPr>
-        <w:spacing w:before="100" w:beforeAutospacing="1" w:after="100" w:afterAutospacing="1" w:line="240" w:lineRule="auto"/>
-        <w:rPr>
-          <w:rFonts w:ascii="Times New Roman" w:eastAsia="Times New Roman" w:hAnsi="Times New Roman" w:cs="Times New Roman"/>
-          <w:sz w:val="24"/>
-          <w:szCs w:val="24"/>
-        </w:rPr>
-      </w:pPr>
-      <w:r>
-        <w:rPr>
-          <w:rFonts w:ascii="Times New Roman" w:eastAsia="Times New Roman" w:hAnsi="Times New Roman" w:cs="Times New Roman"/>
-          <w:sz w:val="24"/>
-          <w:szCs w:val="24"/>
-        </w:rPr>
-        <w:t>վիդեո և աուդիո ֆայլերի ուղարկում,</w:t>
-      </w:r>
-    </w:p>
-    <w:p>
-      <w:pPr>
-        <w:numPr>
-          <w:ilvl w:val="0"/>
-          <w:numId w:val="29"/>
-        </w:numPr>
-        <w:spacing w:before="100" w:beforeAutospacing="1" w:after="100" w:afterAutospacing="1" w:line="240" w:lineRule="auto"/>
-        <w:rPr>
-          <w:rFonts w:ascii="Times New Roman" w:eastAsia="Times New Roman" w:hAnsi="Times New Roman" w:cs="Times New Roman"/>
-          <w:sz w:val="24"/>
-          <w:szCs w:val="24"/>
-        </w:rPr>
-      </w:pPr>
-      <w:r>
-        <w:rPr>
-          <w:rFonts w:ascii="Times New Roman" w:eastAsia="Times New Roman" w:hAnsi="Times New Roman" w:cs="Times New Roman"/>
-          <w:sz w:val="24"/>
-          <w:szCs w:val="24"/>
-        </w:rPr>
-        <w:t>հաղորդագրությունների խմբագրում և ջնջում։</w:t>
-      </w:r>
-    </w:p>
-    <w:p>
-      <w:pPr>
-        <w:spacing w:after="0" w:line="240" w:lineRule="auto"/>
-        <w:rPr>
-          <w:rFonts w:ascii="Times New Roman" w:eastAsia="Times New Roman" w:hAnsi="Times New Roman" w:cs="Times New Roman"/>
-          <w:sz w:val="24"/>
-          <w:szCs w:val="24"/>
-        </w:rPr>
-      </w:pPr>
-      <w:r>
-        <w:rPr>
-          <w:rFonts w:ascii="Times New Roman" w:eastAsia="Times New Roman" w:hAnsi="Times New Roman" w:cs="Times New Roman"/>
-          <w:sz w:val="24"/>
-          <w:szCs w:val="24"/>
-        </w:rPr>
-        <w:pict w14:anchorId="66598EAF">
-          <v:rect id="_x0000_i1047" style="width:0;height:1.5pt" o:hralign="center" o:hrstd="t" o:hr="t" fillcolor="#a0a0a0" stroked="f"/>
-        </w:pict>
-      </w:r>
-    </w:p>
-    <w:p>
-      <w:pPr>
-        <w:spacing w:before="100" w:beforeAutospacing="1" w:after="100" w:afterAutospacing="1" w:line="240" w:lineRule="auto"/>
-        <w:outlineLvl w:val="0"/>
+        <w:t>0</w:t>
+      </w:r>
+      <w:r>
         <w:rPr>
           <w:rFonts w:ascii="Times New Roman" w:eastAsia="Times New Roman" w:hAnsi="Times New Roman" w:cs="Times New Roman"/>
           <w:b/>
@@ -7134,8 +6943,200 @@
           <w:sz w:val="48"/>
           <w:szCs w:val="48"/>
         </w:rPr>
-      </w:pPr>
-      <w:r>
+        <w:t>. Հետագա զարգացման հնարավորություններ</w:t>
+      </w:r>
+    </w:p>
+    <w:p>
+      <w:pPr>
+        <w:spacing w:before="100" w:beforeAutospacing="1" w:after="100" w:afterAutospacing="1" w:line="240" w:lineRule="auto"/>
+        <w:rPr>
+          <w:rFonts w:ascii="Times New Roman" w:eastAsia="Times New Roman" w:hAnsi="Times New Roman" w:cs="Times New Roman"/>
+          <w:sz w:val="24"/>
+          <w:szCs w:val="24"/>
+        </w:rPr>
+      </w:pPr>
+      <w:r>
+        <w:rPr>
+          <w:rFonts w:ascii="Times New Roman" w:eastAsia="Times New Roman" w:hAnsi="Times New Roman" w:cs="Times New Roman"/>
+          <w:sz w:val="24"/>
+          <w:szCs w:val="24"/>
+        </w:rPr>
+        <w:t>Ապագայում հնարավոր է ավելացնել՝</w:t>
+      </w:r>
+    </w:p>
+    <w:p>
+      <w:pPr>
+        <w:numPr>
+          <w:ilvl w:val="0"/>
+          <w:numId w:val="29"/>
+        </w:numPr>
+        <w:spacing w:before="100" w:beforeAutospacing="1" w:after="100" w:afterAutospacing="1" w:line="240" w:lineRule="auto"/>
+        <w:rPr>
+          <w:rFonts w:ascii="Times New Roman" w:eastAsia="Times New Roman" w:hAnsi="Times New Roman" w:cs="Times New Roman"/>
+          <w:sz w:val="24"/>
+          <w:szCs w:val="24"/>
+        </w:rPr>
+      </w:pPr>
+      <w:r>
+        <w:rPr>
+          <w:rFonts w:ascii="Times New Roman" w:eastAsia="Times New Roman" w:hAnsi="Times New Roman" w:cs="Times New Roman"/>
+          <w:sz w:val="24"/>
+          <w:szCs w:val="24"/>
+        </w:rPr>
+        <w:t>խմբային չատեր,</w:t>
+      </w:r>
+    </w:p>
+    <w:p>
+      <w:pPr>
+        <w:numPr>
+          <w:ilvl w:val="0"/>
+          <w:numId w:val="29"/>
+        </w:numPr>
+        <w:spacing w:before="100" w:beforeAutospacing="1" w:after="100" w:afterAutospacing="1" w:line="240" w:lineRule="auto"/>
+        <w:rPr>
+          <w:rFonts w:ascii="Times New Roman" w:eastAsia="Times New Roman" w:hAnsi="Times New Roman" w:cs="Times New Roman"/>
+          <w:sz w:val="24"/>
+          <w:szCs w:val="24"/>
+        </w:rPr>
+      </w:pPr>
+      <w:r>
+        <w:rPr>
+          <w:rFonts w:ascii="Times New Roman" w:eastAsia="Times New Roman" w:hAnsi="Times New Roman" w:cs="Times New Roman"/>
+          <w:sz w:val="24"/>
+          <w:szCs w:val="24"/>
+        </w:rPr>
+        <w:t>WebSocket</w:t>
+      </w:r>
+      <w:r>
+        <w:rPr>
+          <w:rFonts w:ascii="Times New Roman" w:eastAsia="Times New Roman" w:hAnsi="Times New Roman" w:cs="Times New Roman"/>
+          <w:sz w:val="24"/>
+          <w:szCs w:val="24"/>
+          <w:lang w:val="hy-AM"/>
+        </w:rPr>
+        <w:t>,</w:t>
+      </w:r>
+      <w:r>
+        <w:rPr>
+          <w:rFonts w:ascii="Times New Roman" w:eastAsia="Times New Roman" w:hAnsi="Times New Roman" w:cs="Times New Roman"/>
+          <w:sz w:val="24"/>
+          <w:szCs w:val="24"/>
+        </w:rPr>
+        <w:t xml:space="preserve"> AJAX polling-ի փոխարեն,</w:t>
+      </w:r>
+    </w:p>
+    <w:p>
+      <w:pPr>
+        <w:numPr>
+          <w:ilvl w:val="0"/>
+          <w:numId w:val="29"/>
+        </w:numPr>
+        <w:spacing w:before="100" w:beforeAutospacing="1" w:after="100" w:afterAutospacing="1" w:line="240" w:lineRule="auto"/>
+        <w:rPr>
+          <w:rFonts w:ascii="Times New Roman" w:eastAsia="Times New Roman" w:hAnsi="Times New Roman" w:cs="Times New Roman"/>
+          <w:sz w:val="24"/>
+          <w:szCs w:val="24"/>
+        </w:rPr>
+      </w:pPr>
+      <w:r>
+        <w:rPr>
+          <w:rFonts w:ascii="Times New Roman" w:eastAsia="Times New Roman" w:hAnsi="Times New Roman" w:cs="Times New Roman"/>
+          <w:sz w:val="24"/>
+          <w:szCs w:val="24"/>
+        </w:rPr>
+        <w:t>ծանուցումներ,</w:t>
+      </w:r>
+    </w:p>
+    <w:p>
+      <w:pPr>
+        <w:numPr>
+          <w:ilvl w:val="0"/>
+          <w:numId w:val="29"/>
+        </w:numPr>
+        <w:spacing w:before="100" w:beforeAutospacing="1" w:after="100" w:afterAutospacing="1" w:line="240" w:lineRule="auto"/>
+        <w:rPr>
+          <w:rFonts w:ascii="Times New Roman" w:eastAsia="Times New Roman" w:hAnsi="Times New Roman" w:cs="Times New Roman"/>
+          <w:sz w:val="24"/>
+          <w:szCs w:val="24"/>
+        </w:rPr>
+      </w:pPr>
+      <w:r>
+        <w:rPr>
+          <w:rFonts w:ascii="Times New Roman" w:eastAsia="Times New Roman" w:hAnsi="Times New Roman" w:cs="Times New Roman"/>
+          <w:sz w:val="24"/>
+          <w:szCs w:val="24"/>
+        </w:rPr>
+        <w:t>հաղորդագրությունների կոդավորում,</w:t>
+      </w:r>
+    </w:p>
+    <w:p>
+      <w:pPr>
+        <w:numPr>
+          <w:ilvl w:val="0"/>
+          <w:numId w:val="29"/>
+        </w:numPr>
+        <w:spacing w:before="100" w:beforeAutospacing="1" w:after="100" w:afterAutospacing="1" w:line="240" w:lineRule="auto"/>
+        <w:rPr>
+          <w:rFonts w:ascii="Times New Roman" w:eastAsia="Times New Roman" w:hAnsi="Times New Roman" w:cs="Times New Roman"/>
+          <w:sz w:val="24"/>
+          <w:szCs w:val="24"/>
+        </w:rPr>
+      </w:pPr>
+      <w:r>
+        <w:rPr>
+          <w:rFonts w:ascii="Times New Roman" w:eastAsia="Times New Roman" w:hAnsi="Times New Roman" w:cs="Times New Roman"/>
+          <w:sz w:val="24"/>
+          <w:szCs w:val="24"/>
+        </w:rPr>
+        <w:t>վիդեո և աուդիո ֆայլերի ուղարկում,</w:t>
+      </w:r>
+    </w:p>
+    <w:p>
+      <w:pPr>
+        <w:numPr>
+          <w:ilvl w:val="0"/>
+          <w:numId w:val="29"/>
+        </w:numPr>
+        <w:spacing w:before="100" w:beforeAutospacing="1" w:after="100" w:afterAutospacing="1" w:line="240" w:lineRule="auto"/>
+        <w:rPr>
+          <w:rFonts w:ascii="Times New Roman" w:eastAsia="Times New Roman" w:hAnsi="Times New Roman" w:cs="Times New Roman"/>
+          <w:sz w:val="24"/>
+          <w:szCs w:val="24"/>
+        </w:rPr>
+      </w:pPr>
+      <w:r>
+        <w:rPr>
+          <w:rFonts w:ascii="Times New Roman" w:eastAsia="Times New Roman" w:hAnsi="Times New Roman" w:cs="Times New Roman"/>
+          <w:sz w:val="24"/>
+          <w:szCs w:val="24"/>
+        </w:rPr>
+        <w:t>հաղորդագրությունների խմբագրում և ջնջում։</w:t>
+      </w:r>
+    </w:p>
+    <w:p>
+      <w:pPr>
+        <w:spacing w:after="0" w:line="240" w:lineRule="auto"/>
+        <w:rPr>
+          <w:rFonts w:ascii="Times New Roman" w:eastAsia="Times New Roman" w:hAnsi="Times New Roman" w:cs="Times New Roman"/>
+          <w:sz w:val="24"/>
+          <w:szCs w:val="24"/>
+        </w:rPr>
+      </w:pPr>
+      <w:r>
+        <w:rPr>
+          <w:rFonts w:ascii="Times New Roman" w:eastAsia="Times New Roman" w:hAnsi="Times New Roman" w:cs="Times New Roman"/>
+          <w:sz w:val="24"/>
+          <w:szCs w:val="24"/>
+        </w:rPr>
+        <w:pict w14:anchorId="66598EAF">
+          <v:rect id="_x0000_i1047" style="width:0;height:1.5pt" o:hralign="center" o:hrstd="t" o:hr="t" fillcolor="#a0a0a0" stroked="f"/>
+        </w:pict>
+      </w:r>
+    </w:p>
+    <w:p>
+      <w:pPr>
+        <w:spacing w:before="100" w:beforeAutospacing="1" w:after="100" w:afterAutospacing="1" w:line="240" w:lineRule="auto"/>
+        <w:outlineLvl w:val="0"/>
         <w:rPr>
           <w:rFonts w:ascii="Times New Roman" w:eastAsia="Times New Roman" w:hAnsi="Times New Roman" w:cs="Times New Roman"/>
           <w:b/>
@@ -7144,8 +7145,7 @@
           <w:sz w:val="48"/>
           <w:szCs w:val="48"/>
         </w:rPr>
-        <w:t>1</w:t>
-      </w:r>
+      </w:pPr>
       <w:r>
         <w:rPr>
           <w:rFonts w:ascii="Times New Roman" w:eastAsia="Times New Roman" w:hAnsi="Times New Roman" w:cs="Times New Roman"/>
@@ -7155,7 +7155,18 @@
           <w:sz w:val="48"/>
           <w:szCs w:val="48"/>
         </w:rPr>
-        <w:t>2</w:t>
+        <w:t>1</w:t>
+      </w:r>
+      <w:r>
+        <w:rPr>
+          <w:rFonts w:ascii="Times New Roman" w:eastAsia="Times New Roman" w:hAnsi="Times New Roman" w:cs="Times New Roman"/>
+          <w:b/>
+          <w:bCs/>
+          <w:kern w:val="36"/>
+          <w:sz w:val="48"/>
+          <w:szCs w:val="48"/>
+        </w:rPr>
+        <w:t>1</w:t>
       </w:r>
       <w:r>
         <w:rPr>

</xml_diff>